<commit_message>
Letterhead production QA: signatory, print legibility, PDF fixes
- Signatory set to Loyiso Ngcala, Managing Director, in templates and samples
- Formal version: header/footer company information set near-black at
  8 pt so registration, address and contact details survive photocopying
- Logos embedded flattened on white: no soft masks reach the PDF/printer
- PDF export keeps full-resolution images (LibreOffice downsampled to 300 ppi)
- README updated with final QA results and remaining limitations

Co-Authored-By: Claude Opus 5.5 <noreply@anthropic.com>
Claude-Session: https://claude.ai/code/session_0147FCq5iy8mpxdFpxmNCyR1
</commit_message>
<xml_diff>
--- a/12_Letterhead/01_Word-Templates/AurisNexus_Letterhead_Formal-Procurement.docx
+++ b/12_Letterhead/01_Word-Templates/AurisNexus_Letterhead_Formal-Procurement.docx
@@ -395,7 +395,7 @@
         <w:pStyle w:val="SignatureName"/>
       </w:pPr>
       <w:r>
-        <w:t xml:space="preserve">[Full Name]</w:t>
+        <w:t xml:space="preserve">Loyiso Ngcala</w:t>
       </w:r>
     </w:p>
     <w:p>
@@ -403,7 +403,7 @@
         <w:pStyle w:val="SignatureTitle"/>
       </w:pPr>
       <w:r>
-        <w:t xml:space="preserve">[Position]</w:t>
+        <w:t xml:space="preserve">Managing Director</w:t>
       </w:r>
     </w:p>
     <w:p>
@@ -510,8 +510,8 @@
       <w:rPr>
         <w:rFonts w:ascii="Source Sans 3" w:cs="Source Sans 3" w:eastAsia="Source Sans 3" w:hAnsi="Source Sans 3"/>
         <w:color w:val="001A48"/>
-        <w:sz w:val="15"/>
-        <w:szCs w:val="15"/>
+        <w:sz w:val="16"/>
+        <w:szCs w:val="16"/>
       </w:rPr>
       <w:t xml:space="preserve">Auris Nexus Technologies (Pty) Ltd</w:t>
     </w:r>
@@ -519,17 +519,17 @@
       <w:rPr>
         <w:rFonts w:ascii="Source Sans 3" w:cs="Source Sans 3" w:eastAsia="Source Sans 3" w:hAnsi="Source Sans 3"/>
         <w:color w:val="BDC1C5"/>
-        <w:sz w:val="15"/>
-        <w:szCs w:val="15"/>
+        <w:sz w:val="16"/>
+        <w:szCs w:val="16"/>
       </w:rPr>
       <w:t xml:space="preserve">   |   </w:t>
     </w:r>
     <w:r>
       <w:rPr>
         <w:rFonts w:ascii="Source Sans 3" w:cs="Source Sans 3" w:eastAsia="Source Sans 3" w:hAnsi="Source Sans 3"/>
-        <w:color w:val="5A646E"/>
-        <w:sz w:val="15"/>
-        <w:szCs w:val="15"/>
+        <w:color w:val="22282F"/>
+        <w:sz w:val="16"/>
+        <w:szCs w:val="16"/>
       </w:rPr>
       <w:t xml:space="preserve">Registration No. 2026/606690/07</w:t>
     </w:r>
@@ -537,17 +537,17 @@
       <w:rPr>
         <w:rFonts w:ascii="Source Sans 3" w:cs="Source Sans 3" w:eastAsia="Source Sans 3" w:hAnsi="Source Sans 3"/>
         <w:color w:val="BDC1C5"/>
-        <w:sz w:val="15"/>
-        <w:szCs w:val="15"/>
+        <w:sz w:val="16"/>
+        <w:szCs w:val="16"/>
       </w:rPr>
       <w:t xml:space="preserve">   |   </w:t>
     </w:r>
     <w:r>
       <w:rPr>
         <w:rFonts w:ascii="Source Sans 3" w:cs="Source Sans 3" w:eastAsia="Source Sans 3" w:hAnsi="Source Sans 3"/>
-        <w:color w:val="5A646E"/>
-        <w:sz w:val="15"/>
-        <w:szCs w:val="15"/>
+        <w:color w:val="22282F"/>
+        <w:sz w:val="16"/>
+        <w:szCs w:val="16"/>
       </w:rPr>
       <w:t xml:space="preserve">B-BBEE Level 1</w:t>
     </w:r>
@@ -557,18 +557,18 @@
     <w:r>
       <w:rPr>
         <w:rFonts w:ascii="Source Sans 3" w:cs="Source Sans 3" w:eastAsia="Source Sans 3" w:hAnsi="Source Sans 3"/>
-        <w:color w:val="5A646E"/>
-        <w:sz w:val="15"/>
-        <w:szCs w:val="15"/>
+        <w:color w:val="22282F"/>
+        <w:sz w:val="16"/>
+        <w:szCs w:val="16"/>
       </w:rPr>
       <w:t xml:space="preserve">Page </w:t>
     </w:r>
     <w:r>
       <w:rPr>
         <w:rFonts w:ascii="Source Sans 3" w:cs="Source Sans 3" w:eastAsia="Source Sans 3" w:hAnsi="Source Sans 3"/>
-        <w:color w:val="5A646E"/>
-        <w:sz w:val="15"/>
-        <w:szCs w:val="15"/>
+        <w:color w:val="22282F"/>
+        <w:sz w:val="16"/>
+        <w:szCs w:val="16"/>
       </w:rPr>
       <w:fldChar w:fldCharType="begin"/>
       <w:instrText xml:space="preserve">PAGE</w:instrText>
@@ -578,18 +578,18 @@
     <w:r>
       <w:rPr>
         <w:rFonts w:ascii="Source Sans 3" w:cs="Source Sans 3" w:eastAsia="Source Sans 3" w:hAnsi="Source Sans 3"/>
-        <w:color w:val="5A646E"/>
-        <w:sz w:val="15"/>
-        <w:szCs w:val="15"/>
+        <w:color w:val="22282F"/>
+        <w:sz w:val="16"/>
+        <w:szCs w:val="16"/>
       </w:rPr>
       <w:t xml:space="preserve"> of </w:t>
     </w:r>
     <w:r>
       <w:rPr>
         <w:rFonts w:ascii="Source Sans 3" w:cs="Source Sans 3" w:eastAsia="Source Sans 3" w:hAnsi="Source Sans 3"/>
-        <w:color w:val="5A646E"/>
-        <w:sz w:val="15"/>
-        <w:szCs w:val="15"/>
+        <w:color w:val="22282F"/>
+        <w:sz w:val="16"/>
+        <w:szCs w:val="16"/>
       </w:rPr>
       <w:fldChar w:fldCharType="begin"/>
       <w:instrText xml:space="preserve">NUMPAGES</w:instrText>
@@ -683,9 +683,9 @@
           <w:r>
             <w:rPr>
               <w:rFonts w:ascii="Source Sans 3" w:cs="Source Sans 3" w:eastAsia="Source Sans 3" w:hAnsi="Source Sans 3"/>
-              <w:color w:val="5A646E"/>
-              <w:sz w:val="15"/>
-              <w:szCs w:val="15"/>
+              <w:color w:val="22282F"/>
+              <w:sz w:val="16"/>
+              <w:szCs w:val="16"/>
             </w:rPr>
             <w:t xml:space="preserve">Registration No. 2026/606690/07</w:t>
           </w:r>
@@ -698,9 +698,9 @@
           <w:r>
             <w:rPr>
               <w:rFonts w:ascii="Source Sans 3" w:cs="Source Sans 3" w:eastAsia="Source Sans 3" w:hAnsi="Source Sans 3"/>
-              <w:color w:val="5A646E"/>
-              <w:sz w:val="15"/>
-              <w:szCs w:val="15"/>
+              <w:color w:val="22282F"/>
+              <w:sz w:val="16"/>
+              <w:szCs w:val="16"/>
             </w:rPr>
             <w:t xml:space="preserve">B-BBEE Level 1</w:t>
           </w:r>
@@ -731,9 +731,9 @@
           <w:r>
             <w:rPr>
               <w:rFonts w:ascii="Source Sans 3" w:cs="Source Sans 3" w:eastAsia="Source Sans 3" w:hAnsi="Source Sans 3"/>
-              <w:color w:val="5A646E"/>
-              <w:sz w:val="15"/>
-              <w:szCs w:val="15"/>
+              <w:color w:val="22282F"/>
+              <w:sz w:val="16"/>
+              <w:szCs w:val="16"/>
             </w:rPr>
             <w:t xml:space="preserve">140 Linden Road</w:t>
           </w:r>
@@ -746,9 +746,9 @@
           <w:r>
             <w:rPr>
               <w:rFonts w:ascii="Source Sans 3" w:cs="Source Sans 3" w:eastAsia="Source Sans 3" w:hAnsi="Source Sans 3"/>
-              <w:color w:val="5A646E"/>
-              <w:sz w:val="15"/>
-              <w:szCs w:val="15"/>
+              <w:color w:val="22282F"/>
+              <w:sz w:val="16"/>
+              <w:szCs w:val="16"/>
             </w:rPr>
             <w:t xml:space="preserve">Sandown, Sandton</w:t>
           </w:r>
@@ -761,9 +761,9 @@
           <w:r>
             <w:rPr>
               <w:rFonts w:ascii="Source Sans 3" w:cs="Source Sans 3" w:eastAsia="Source Sans 3" w:hAnsi="Source Sans 3"/>
-              <w:color w:val="5A646E"/>
-              <w:sz w:val="15"/>
-              <w:szCs w:val="15"/>
+              <w:color w:val="22282F"/>
+              <w:sz w:val="16"/>
+              <w:szCs w:val="16"/>
             </w:rPr>
             <w:t xml:space="preserve">Gauteng, South Africa</w:t>
           </w:r>
@@ -794,7 +794,7 @@
           <w:r>
             <w:rPr>
               <w:rFonts w:ascii="Saira SemiBold" w:cs="Saira SemiBold" w:eastAsia="Saira SemiBold" w:hAnsi="Saira SemiBold"/>
-              <w:color w:val="0B5E9A"/>
+              <w:color w:val="001A48"/>
               <w:sz w:val="14"/>
               <w:szCs w:val="14"/>
             </w:rPr>
@@ -803,19 +803,19 @@
           <w:r>
             <w:rPr>
               <w:rFonts w:ascii="Source Sans 3" w:cs="Source Sans 3" w:eastAsia="Source Sans 3" w:hAnsi="Source Sans 3"/>
-              <w:color w:val="5A646E"/>
-              <w:sz w:val="15"/>
-              <w:szCs w:val="15"/>
+              <w:color w:val="22282F"/>
+              <w:sz w:val="16"/>
+              <w:szCs w:val="16"/>
             </w:rPr>
             <w:t xml:space="preserve">   </w:t>
           </w:r>
-          <w:hyperlink w:history="1" r:id="rIdwknsehowdocdg3aptemnq">
+          <w:hyperlink w:history="1" r:id="rIdu6npz0t6wfukhj2gumwes">
             <w:r>
               <w:rPr>
                 <w:rFonts w:ascii="Source Sans 3" w:cs="Source Sans 3" w:eastAsia="Source Sans 3" w:hAnsi="Source Sans 3"/>
-                <w:color w:val="5A646E"/>
-                <w:sz w:val="15"/>
-                <w:szCs w:val="15"/>
+                <w:color w:val="22282F"/>
+                <w:sz w:val="16"/>
+                <w:szCs w:val="16"/>
               </w:rPr>
               <w:t xml:space="preserve">063 122 6552</w:t>
             </w:r>
@@ -829,7 +829,7 @@
           <w:r>
             <w:rPr>
               <w:rFonts w:ascii="Saira SemiBold" w:cs="Saira SemiBold" w:eastAsia="Saira SemiBold" w:hAnsi="Saira SemiBold"/>
-              <w:color w:val="0B5E9A"/>
+              <w:color w:val="001A48"/>
               <w:sz w:val="14"/>
               <w:szCs w:val="14"/>
             </w:rPr>
@@ -838,19 +838,19 @@
           <w:r>
             <w:rPr>
               <w:rFonts w:ascii="Source Sans 3" w:cs="Source Sans 3" w:eastAsia="Source Sans 3" w:hAnsi="Source Sans 3"/>
-              <w:color w:val="5A646E"/>
-              <w:sz w:val="15"/>
-              <w:szCs w:val="15"/>
+              <w:color w:val="22282F"/>
+              <w:sz w:val="16"/>
+              <w:szCs w:val="16"/>
             </w:rPr>
             <w:t xml:space="preserve">   </w:t>
           </w:r>
-          <w:hyperlink w:history="1" r:id="rIdcm4mfxnfgt1v_s4z5skzb">
+          <w:hyperlink w:history="1" r:id="rIds7yntwf3s6nybwpsc_aqo">
             <w:r>
               <w:rPr>
                 <w:rFonts w:ascii="Source Sans 3" w:cs="Source Sans 3" w:eastAsia="Source Sans 3" w:hAnsi="Source Sans 3"/>
-                <w:color w:val="5A646E"/>
-                <w:sz w:val="15"/>
-                <w:szCs w:val="15"/>
+                <w:color w:val="22282F"/>
+                <w:sz w:val="16"/>
+                <w:szCs w:val="16"/>
               </w:rPr>
               <w:t xml:space="preserve">info@aurisnexus.co.za</w:t>
             </w:r>
@@ -864,7 +864,7 @@
           <w:r>
             <w:rPr>
               <w:rFonts w:ascii="Saira SemiBold" w:cs="Saira SemiBold" w:eastAsia="Saira SemiBold" w:hAnsi="Saira SemiBold"/>
-              <w:color w:val="0B5E9A"/>
+              <w:color w:val="001A48"/>
               <w:sz w:val="14"/>
               <w:szCs w:val="14"/>
             </w:rPr>
@@ -873,19 +873,19 @@
           <w:r>
             <w:rPr>
               <w:rFonts w:ascii="Source Sans 3" w:cs="Source Sans 3" w:eastAsia="Source Sans 3" w:hAnsi="Source Sans 3"/>
-              <w:color w:val="5A646E"/>
-              <w:sz w:val="15"/>
-              <w:szCs w:val="15"/>
+              <w:color w:val="22282F"/>
+              <w:sz w:val="16"/>
+              <w:szCs w:val="16"/>
             </w:rPr>
             <w:t xml:space="preserve">   </w:t>
           </w:r>
-          <w:hyperlink w:history="1" r:id="rIdwi3saduqjubfssvh8me0g">
+          <w:hyperlink w:history="1" r:id="rIdzhumzlvyaxdtjrl53wu-5">
             <w:r>
               <w:rPr>
                 <w:rFonts w:ascii="Source Sans 3" w:cs="Source Sans 3" w:eastAsia="Source Sans 3" w:hAnsi="Source Sans 3"/>
-                <w:color w:val="5A646E"/>
-                <w:sz w:val="15"/>
-                <w:szCs w:val="15"/>
+                <w:color w:val="22282F"/>
+                <w:sz w:val="16"/>
+                <w:szCs w:val="16"/>
               </w:rPr>
               <w:t xml:space="preserve">aurisnexus.co.za</w:t>
             </w:r>
@@ -918,18 +918,18 @@
           <w:r>
             <w:rPr>
               <w:rFonts w:ascii="Source Sans 3" w:cs="Source Sans 3" w:eastAsia="Source Sans 3" w:hAnsi="Source Sans 3"/>
-              <w:color w:val="5A646E"/>
-              <w:sz w:val="15"/>
-              <w:szCs w:val="15"/>
+              <w:color w:val="22282F"/>
+              <w:sz w:val="16"/>
+              <w:szCs w:val="16"/>
             </w:rPr>
             <w:t xml:space="preserve">Page </w:t>
           </w:r>
           <w:r>
             <w:rPr>
               <w:rFonts w:ascii="Source Sans 3" w:cs="Source Sans 3" w:eastAsia="Source Sans 3" w:hAnsi="Source Sans 3"/>
-              <w:color w:val="5A646E"/>
-              <w:sz w:val="15"/>
-              <w:szCs w:val="15"/>
+              <w:color w:val="22282F"/>
+              <w:sz w:val="16"/>
+              <w:szCs w:val="16"/>
             </w:rPr>
             <w:fldChar w:fldCharType="begin"/>
             <w:instrText xml:space="preserve">PAGE</w:instrText>
@@ -939,18 +939,18 @@
           <w:r>
             <w:rPr>
               <w:rFonts w:ascii="Source Sans 3" w:cs="Source Sans 3" w:eastAsia="Source Sans 3" w:hAnsi="Source Sans 3"/>
-              <w:color w:val="5A646E"/>
-              <w:sz w:val="15"/>
-              <w:szCs w:val="15"/>
+              <w:color w:val="22282F"/>
+              <w:sz w:val="16"/>
+              <w:szCs w:val="16"/>
             </w:rPr>
             <w:t xml:space="preserve"> of </w:t>
           </w:r>
           <w:r>
             <w:rPr>
               <w:rFonts w:ascii="Source Sans 3" w:cs="Source Sans 3" w:eastAsia="Source Sans 3" w:hAnsi="Source Sans 3"/>
-              <w:color w:val="5A646E"/>
-              <w:sz w:val="15"/>
-              <w:szCs w:val="15"/>
+              <w:color w:val="22282F"/>
+              <w:sz w:val="16"/>
+              <w:szCs w:val="16"/>
             </w:rPr>
             <w:fldChar w:fldCharType="begin"/>
             <w:instrText xml:space="preserve">NUMPAGES</w:instrText>
@@ -1155,9 +1155,9 @@
           <w:r>
             <w:rPr>
               <w:rFonts w:ascii="Source Sans 3" w:cs="Source Sans 3" w:eastAsia="Source Sans 3" w:hAnsi="Source Sans 3"/>
-              <w:color w:val="5A646E"/>
-              <w:sz w:val="15"/>
-              <w:szCs w:val="15"/>
+              <w:color w:val="22282F"/>
+              <w:sz w:val="16"/>
+              <w:szCs w:val="16"/>
             </w:rPr>
             <w:t xml:space="preserve">Our ref: </w:t>
           </w:r>
@@ -1165,8 +1165,8 @@
             <w:rPr>
               <w:rFonts w:ascii="Source Sans 3" w:cs="Source Sans 3" w:eastAsia="Source Sans 3" w:hAnsi="Source Sans 3"/>
               <w:color w:val="22282F"/>
-              <w:sz w:val="15"/>
-              <w:szCs w:val="15"/>
+              <w:sz w:val="16"/>
+              <w:szCs w:val="16"/>
             </w:rPr>
             <w:t xml:space="preserve">AN/[Year]/[Number]</w:t>
           </w:r>
@@ -1365,9 +1365,9 @@
           <w:r>
             <w:rPr>
               <w:rFonts w:ascii="Source Sans 3" w:cs="Source Sans 3" w:eastAsia="Source Sans 3" w:hAnsi="Source Sans 3"/>
-              <w:color w:val="5A646E"/>
-              <w:sz w:val="15"/>
-              <w:szCs w:val="15"/>
+              <w:color w:val="22282F"/>
+              <w:sz w:val="16"/>
+              <w:szCs w:val="16"/>
             </w:rPr>
             <w:t xml:space="preserve">Registration No. 2026/606690/07</w:t>
           </w:r>
@@ -1375,17 +1375,17 @@
             <w:rPr>
               <w:rFonts w:ascii="Source Sans 3" w:cs="Source Sans 3" w:eastAsia="Source Sans 3" w:hAnsi="Source Sans 3"/>
               <w:color w:val="BDC1C5"/>
-              <w:sz w:val="15"/>
-              <w:szCs w:val="15"/>
+              <w:sz w:val="16"/>
+              <w:szCs w:val="16"/>
             </w:rPr>
             <w:t xml:space="preserve">   |   </w:t>
           </w:r>
           <w:r>
             <w:rPr>
               <w:rFonts w:ascii="Source Sans 3" w:cs="Source Sans 3" w:eastAsia="Source Sans 3" w:hAnsi="Source Sans 3"/>
-              <w:color w:val="5A646E"/>
-              <w:sz w:val="15"/>
-              <w:szCs w:val="15"/>
+              <w:color w:val="22282F"/>
+              <w:sz w:val="16"/>
+              <w:szCs w:val="16"/>
             </w:rPr>
             <w:t xml:space="preserve">B-BBEE Level 1</w:t>
           </w:r>

</xml_diff>

<commit_message>
Add CSD supplier number to Formal letterhead; fix heading styles
- Formal / Procurement: CSD Supplier No. R0341462686 on the first-page
  footer and in the sample bidder table (source: Fact Register E10)
- Heading 1/2 were defined twice in styles.xml (docx-js default plus the
  brand style); Word could pick the unbranded default. Now restyled via
  the built-in heading defaults, so each is defined once
- Removed spacer paragraphs between tables and headings, which made
  LibreOffice ignore keep-with-next and strand a heading at a page foot
- README updated to match

Co-Authored-By: Claude Opus 5.5 <noreply@anthropic.com>
Claude-Session: https://claude.ai/code/session_0147FCq5iy8mpxdFpxmNCyR1
</commit_message>
<xml_diff>
--- a/12_Letterhead/01_Word-Templates/AurisNexus_Letterhead_Formal-Procurement.docx
+++ b/12_Letterhead/01_Word-Templates/AurisNexus_Letterhead_Formal-Procurement.docx
@@ -705,6 +705,21 @@
             <w:t xml:space="preserve">B-BBEE Level 1</w:t>
           </w:r>
         </w:p>
+        <w:p>
+          <w:pPr>
+            <w:pStyle w:val="Footer"/>
+            <w:spacing w:after="0" w:before="0" w:line="200" w:lineRule="exact"/>
+          </w:pPr>
+          <w:r>
+            <w:rPr>
+              <w:rFonts w:ascii="Source Sans 3" w:cs="Source Sans 3" w:eastAsia="Source Sans 3" w:hAnsi="Source Sans 3"/>
+              <w:color w:val="22282F"/>
+              <w:sz w:val="16"/>
+              <w:szCs w:val="16"/>
+            </w:rPr>
+            <w:t xml:space="preserve">CSD Supplier No. R0341462686</w:t>
+          </w:r>
+        </w:p>
       </w:tc>
       <w:tc>
         <w:tcPr>
@@ -809,7 +824,7 @@
             </w:rPr>
             <w:t xml:space="preserve">   </w:t>
           </w:r>
-          <w:hyperlink w:history="1" r:id="rIdu6npz0t6wfukhj2gumwes">
+          <w:hyperlink w:history="1" r:id="rIdd9yoeuktdysndarkcpfr0">
             <w:r>
               <w:rPr>
                 <w:rFonts w:ascii="Source Sans 3" w:cs="Source Sans 3" w:eastAsia="Source Sans 3" w:hAnsi="Source Sans 3"/>
@@ -844,7 +859,7 @@
             </w:rPr>
             <w:t xml:space="preserve">   </w:t>
           </w:r>
-          <w:hyperlink w:history="1" r:id="rIds7yntwf3s6nybwpsc_aqo">
+          <w:hyperlink w:history="1" r:id="rIdtsbvhp10iahzslkoyb64v">
             <w:r>
               <w:rPr>
                 <w:rFonts w:ascii="Source Sans 3" w:cs="Source Sans 3" w:eastAsia="Source Sans 3" w:hAnsi="Source Sans 3"/>
@@ -879,7 +894,7 @@
             </w:rPr>
             <w:t xml:space="preserve">   </w:t>
           </w:r>
-          <w:hyperlink w:history="1" r:id="rIdzhumzlvyaxdtjrl53wu-5">
+          <w:hyperlink w:history="1" r:id="rIdpswkjaes1t-oibass0xyx">
             <w:r>
               <w:rPr>
                 <w:rFonts w:ascii="Source Sans 3" w:cs="Source Sans 3" w:eastAsia="Source Sans 3" w:hAnsi="Source Sans 3"/>
@@ -1639,10 +1654,18 @@
     <w:basedOn w:val="Normal"/>
     <w:next w:val="Normal"/>
     <w:qFormat/>
-    <w:rPr>
-      <w:color w:val="2E74B5"/>
-      <w:sz w:val="32"/>
-      <w:szCs w:val="32"/>
+    <w:pPr>
+      <w:keepNext/>
+      <w:keepLines/>
+      <w:spacing w:after="90" w:before="260" w:line="270"/>
+      <w:outlineLvl w:val="0"/>
+    </w:pPr>
+    <w:rPr>
+      <w:rFonts w:ascii="Saira SemiBold" w:cs="Saira SemiBold" w:eastAsia="Saira SemiBold" w:hAnsi="Saira SemiBold"/>
+      <w:color w:val="001A48"/>
+      <w:spacing w:val="4"/>
+      <w:sz w:val="21"/>
+      <w:szCs w:val="21"/>
     </w:rPr>
   </w:style>
   <w:style w:type="paragraph" w:styleId="Heading2">
@@ -1650,10 +1673,19 @@
     <w:basedOn w:val="Normal"/>
     <w:next w:val="Normal"/>
     <w:qFormat/>
-    <w:rPr>
-      <w:color w:val="2E74B5"/>
-      <w:sz w:val="26"/>
-      <w:szCs w:val="26"/>
+    <w:pPr>
+      <w:keepNext/>
+      <w:keepLines/>
+      <w:spacing w:after="60" w:before="180"/>
+      <w:outlineLvl w:val="1"/>
+    </w:pPr>
+    <w:rPr>
+      <w:rFonts w:ascii="Source Sans 3" w:cs="Source Sans 3" w:eastAsia="Source Sans 3" w:hAnsi="Source Sans 3"/>
+      <w:b/>
+      <w:bCs/>
+      <w:color w:val="001A48"/>
+      <w:sz w:val="21"/>
+      <w:szCs w:val="21"/>
     </w:rPr>
   </w:style>
   <w:style w:type="paragraph" w:styleId="Heading3">
@@ -1833,45 +1865,6 @@
       <w:szCs w:val="15"/>
     </w:rPr>
   </w:style>
-  <w:style w:type="paragraph" w:styleId="Heading1">
-    <w:name w:val="Heading 1"/>
-    <w:basedOn w:val="Normal"/>
-    <w:next w:val="Normal"/>
-    <w:qFormat/>
-    <w:pPr>
-      <w:keepNext/>
-      <w:keepLines/>
-      <w:spacing w:after="90" w:before="260" w:line="270"/>
-      <w:outlineLvl w:val="0"/>
-    </w:pPr>
-    <w:rPr>
-      <w:rFonts w:ascii="Saira SemiBold" w:cs="Saira SemiBold" w:eastAsia="Saira SemiBold" w:hAnsi="Saira SemiBold"/>
-      <w:color w:val="001A48"/>
-      <w:spacing w:val="4"/>
-      <w:sz w:val="21"/>
-      <w:szCs w:val="21"/>
-    </w:rPr>
-  </w:style>
-  <w:style w:type="paragraph" w:styleId="Heading2">
-    <w:name w:val="Heading 2"/>
-    <w:basedOn w:val="Normal"/>
-    <w:next w:val="Normal"/>
-    <w:qFormat/>
-    <w:pPr>
-      <w:keepNext/>
-      <w:keepLines/>
-      <w:spacing w:after="60" w:before="180"/>
-      <w:outlineLvl w:val="1"/>
-    </w:pPr>
-    <w:rPr>
-      <w:rFonts w:ascii="Source Sans 3" w:cs="Source Sans 3" w:eastAsia="Source Sans 3" w:hAnsi="Source Sans 3"/>
-      <w:b/>
-      <w:bCs/>
-      <w:color w:val="001A48"/>
-      <w:sz w:val="21"/>
-      <w:szCs w:val="21"/>
-    </w:rPr>
-  </w:style>
   <w:style w:type="paragraph" w:styleId="LetterDate">
     <w:name w:val="Letter Date"/>
     <w:basedOn w:val="Normal"/>

</xml_diff>